<commit_message>
feat(frontend/backend): implementation of login/signup
</commit_message>
<xml_diff>
--- a/docs/Vaniga - SRS.docx
+++ b/docs/Vaniga - SRS.docx
@@ -144,8 +144,13 @@
         </w:rPr>
       </w:pPr>
       <w:r>
-        <w:t>Express / Prisma + MongoDB</w:t>
-      </w:r>
+        <w:t xml:space="preserve">Express / Prisma + </w:t>
+      </w:r>
+      <w:proofErr w:type="spellStart"/>
+      <w:r>
+        <w:t>Postgress</w:t>
+      </w:r>
+      <w:proofErr w:type="spellEnd"/>
     </w:p>
     <w:p>
       <w:pPr>
@@ -447,10 +452,7 @@
       </w:r>
       <w:proofErr w:type="gramEnd"/>
       <w:r>
-        <w:t xml:space="preserve"> Description, Price (Strikeout old and new prize), Add to cart button</w:t>
-      </w:r>
-      <w:r>
-        <w:t>, View cart</w:t>
+        <w:t xml:space="preserve"> Description, Price (Strikeout old and new prize), Add to cart button, View cart</w:t>
       </w:r>
       <w:r>
         <w:br/>
@@ -1211,21 +1213,7 @@
         <w:rPr>
           <w:lang w:val="en-US"/>
         </w:rPr>
-        <w:t>           </w:t>
-      </w:r>
-      <w:proofErr w:type="spellStart"/>
-      <w:r>
-        <w:rPr>
-          <w:lang w:val="en-US"/>
-        </w:rPr>
-        <w:t>Role</w:t>
-      </w:r>
-      <w:proofErr w:type="spellEnd"/>
-      <w:r>
-        <w:rPr>
-          <w:lang w:val="en-US"/>
-        </w:rPr>
-        <w:t>     @default(</w:t>
+        <w:t>           Role     @default(</w:t>
       </w:r>
       <w:proofErr w:type="gramEnd"/>
       <w:r>
@@ -1352,21 +1340,7 @@
         <w:rPr>
           <w:lang w:val="en-US"/>
         </w:rPr>
-        <w:t>  address         </w:t>
-      </w:r>
-      <w:proofErr w:type="spellStart"/>
-      <w:r>
-        <w:rPr>
-          <w:lang w:val="en-US"/>
-        </w:rPr>
-        <w:t>Address</w:t>
-      </w:r>
-      <w:proofErr w:type="spellEnd"/>
-      <w:r>
-        <w:rPr>
-          <w:lang w:val="en-US"/>
-        </w:rPr>
-        <w:t>? </w:t>
+        <w:t>  address         Address? </w:t>
       </w:r>
     </w:p>
     <w:p>
@@ -1447,21 +1421,7 @@
         <w:rPr>
           <w:lang w:val="en-US"/>
         </w:rPr>
-        <w:t> </w:t>
-      </w:r>
-      <w:proofErr w:type="spellStart"/>
-      <w:r>
-        <w:rPr>
-          <w:lang w:val="en-US"/>
-        </w:rPr>
-        <w:t>Cart</w:t>
-      </w:r>
-      <w:proofErr w:type="spellEnd"/>
-      <w:r>
-        <w:rPr>
-          <w:lang w:val="en-US"/>
-        </w:rPr>
-        <w:t>? </w:t>
+        <w:t> Cart? </w:t>
       </w:r>
     </w:p>
     <w:p>
@@ -2331,21 +2291,7 @@
         <w:rPr>
           <w:lang w:val="en-US"/>
         </w:rPr>
-        <w:t>     </w:t>
-      </w:r>
-      <w:proofErr w:type="spellStart"/>
-      <w:r>
-        <w:rPr>
-          <w:lang w:val="en-US"/>
-        </w:rPr>
-        <w:t>User</w:t>
-      </w:r>
-      <w:proofErr w:type="spellEnd"/>
-      <w:r>
-        <w:rPr>
-          <w:lang w:val="en-US"/>
-        </w:rPr>
-        <w:t>       @relation(</w:t>
+        <w:t>     User       @relation(</w:t>
       </w:r>
       <w:proofErr w:type="gramEnd"/>
       <w:r>
@@ -2732,21 +2678,7 @@
         <w:rPr>
           <w:lang w:val="en-US"/>
         </w:rPr>
-        <w:t>           </w:t>
-      </w:r>
-      <w:proofErr w:type="spellStart"/>
-      <w:r>
-        <w:rPr>
-          <w:lang w:val="en-US"/>
-        </w:rPr>
-        <w:t>User</w:t>
-      </w:r>
-      <w:proofErr w:type="spellEnd"/>
-      <w:r>
-        <w:rPr>
-          <w:lang w:val="en-US"/>
-        </w:rPr>
-        <w:t>        @relation(</w:t>
+        <w:t>           User        @relation(</w:t>
       </w:r>
       <w:proofErr w:type="gramEnd"/>
       <w:r>
@@ -7208,6 +7140,188 @@
         <w:t>main.tsx</w:t>
       </w:r>
       <w:proofErr w:type="spellEnd"/>
+    </w:p>
+    <w:p/>
+    <w:p/>
+    <w:p/>
+    <w:p/>
+    <w:p/>
+    <w:p/>
+    <w:p/>
+    <w:p/>
+    <w:p>
+      <w:pPr>
+        <w:rPr>
+          <w:b/>
+          <w:bCs/>
+        </w:rPr>
+      </w:pPr>
+      <w:r>
+        <w:rPr>
+          <w:b/>
+          <w:bCs/>
+        </w:rPr>
+        <w:lastRenderedPageBreak/>
+        <w:t>Testing</w:t>
+      </w:r>
+    </w:p>
+    <w:p>
+      <w:pPr>
+        <w:rPr>
+          <w:b/>
+          <w:bCs/>
+        </w:rPr>
+      </w:pPr>
+      <w:r>
+        <w:rPr>
+          <w:b/>
+          <w:bCs/>
+        </w:rPr>
+        <w:t xml:space="preserve">POST – </w:t>
+      </w:r>
+      <w:proofErr w:type="spellStart"/>
+      <w:r>
+        <w:rPr>
+          <w:b/>
+          <w:bCs/>
+        </w:rPr>
+        <w:t>baseurl</w:t>
+      </w:r>
+      <w:proofErr w:type="spellEnd"/>
+      <w:r>
+        <w:rPr>
+          <w:b/>
+          <w:bCs/>
+        </w:rPr>
+        <w:t>/auth/</w:t>
+      </w:r>
+      <w:proofErr w:type="spellStart"/>
+      <w:r>
+        <w:rPr>
+          <w:b/>
+          <w:bCs/>
+        </w:rPr>
+        <w:t>singup</w:t>
+      </w:r>
+      <w:proofErr w:type="spellEnd"/>
+    </w:p>
+    <w:p>
+      <w:r>
+        <w:t>{</w:t>
+      </w:r>
+    </w:p>
+    <w:p>
+      <w:r>
+        <w:t>    "name": "Praveen Kumar V",</w:t>
+      </w:r>
+    </w:p>
+    <w:p>
+      <w:r>
+        <w:t>    "email": "praveen@vaniga.com",</w:t>
+      </w:r>
+    </w:p>
+    <w:p>
+      <w:r>
+        <w:t>    "password": "12345",</w:t>
+      </w:r>
+    </w:p>
+    <w:p>
+      <w:r>
+        <w:t>    "role": "BUYER"</w:t>
+      </w:r>
+    </w:p>
+    <w:p>
+      <w:r>
+        <w:t>}</w:t>
+      </w:r>
+    </w:p>
+    <w:p/>
+    <w:p>
+      <w:pPr>
+        <w:rPr>
+          <w:b/>
+          <w:bCs/>
+        </w:rPr>
+      </w:pPr>
+      <w:r>
+        <w:rPr>
+          <w:b/>
+          <w:bCs/>
+        </w:rPr>
+        <w:t xml:space="preserve">POST – </w:t>
+      </w:r>
+      <w:proofErr w:type="spellStart"/>
+      <w:r>
+        <w:rPr>
+          <w:b/>
+          <w:bCs/>
+        </w:rPr>
+        <w:t>baseurl</w:t>
+      </w:r>
+      <w:proofErr w:type="spellEnd"/>
+      <w:r>
+        <w:rPr>
+          <w:b/>
+          <w:bCs/>
+        </w:rPr>
+        <w:t>/auth/login</w:t>
+      </w:r>
+    </w:p>
+    <w:p>
+      <w:r>
+        <w:t>{</w:t>
+      </w:r>
+    </w:p>
+    <w:p>
+      <w:r>
+        <w:t>    "email": "praveen@vaniga.com",</w:t>
+      </w:r>
+    </w:p>
+    <w:p>
+      <w:r>
+        <w:t>    "password": "12345"</w:t>
+      </w:r>
+    </w:p>
+    <w:p>
+      <w:r>
+        <w:t>}</w:t>
+      </w:r>
+    </w:p>
+    <w:p/>
+    <w:p>
+      <w:r>
+        <w:rPr>
+          <w:b/>
+          <w:bCs/>
+        </w:rPr>
+        <w:t xml:space="preserve">POST – </w:t>
+      </w:r>
+      <w:proofErr w:type="spellStart"/>
+      <w:r>
+        <w:rPr>
+          <w:b/>
+          <w:bCs/>
+        </w:rPr>
+        <w:t>baseurl</w:t>
+      </w:r>
+      <w:proofErr w:type="spellEnd"/>
+      <w:r>
+        <w:rPr>
+          <w:b/>
+          <w:bCs/>
+        </w:rPr>
+        <w:t>/auth/log</w:t>
+      </w:r>
+      <w:r>
+        <w:rPr>
+          <w:b/>
+          <w:bCs/>
+        </w:rPr>
+        <w:t>out</w:t>
+      </w:r>
+      <w:r>
+        <w:t xml:space="preserve">    No body</w:t>
+      </w:r>
     </w:p>
     <w:p/>
     <w:p/>

</xml_diff>